<commit_message>
Part K: what the backtest turned out to be
The reassessment document now carries the 18 September finding in full -- that series
(a) does not rebuild the construction it grades (five explicit years against PHDC's
fifteen), that every cell it ever scored breached [R-MACRO-01]'s convergence bound,
that the route out is already in the repository and dated before every origin it would
serve, and that re-sealing the declaration is the principal's decision rather than the
desk's.

Beside it: the terminal ERP that alone normalises and alone runs optimistic; the
delivered bibliography nothing read; a rule cited as a reason in seven passages, every
one deferring a correction that raises the value; and the recorded debt counted at 386
against the 47 the repair rule was adopted on.

264 paragraphs, 8 tables, 48 headings.

Co-Authored-By: Claude Opus 5 <noreply@anthropic.com>
Claude-Session: https://claude.ai/code/session_017RcjXG4ETjADcoFJf123yY
</commit_message>
<xml_diff>
--- a/engine/method_reassessment/Fundamental_Method_Reassessment_02-09-2026.docx
+++ b/engine/method_reassessment/Fundamental_Method_Reassessment_02-09-2026.docx
@@ -18998,6 +18998,1125 @@
     <w:p>
       <w:r>
         <w:t>Where a process has two halves and only one of them binds, count what crosses.</w:t>
+      </w:r>
+    </w:p>
+    <w:p>
+      <w:pPr>
+        <w:pStyle w:val="Heading2"/>
+      </w:pPr>
+      <w:r>
+        <w:t>Part K — The night of 18 September: what the backtest turned out to be</w:t>
+      </w:r>
+    </w:p>
+    <w:p>
+      <w:r>
+        <w:t>Part I closed with the five remaining assessments done and the implementation pass outstanding. This is what happened when the calibration was actually run.</w:t>
+      </w:r>
+    </w:p>
+    <w:p>
+      <w:pPr>
+        <w:pStyle w:val="Heading3"/>
+      </w:pPr>
+      <w:r>
+        <w:t>The instrument does not rebuild the construction it grades</w:t>
+      </w:r>
+    </w:p>
+    <w:p>
+      <w:r>
+        <w:t>Series (a) — the mechanical fair value, the thing criterion 3's clause A is computed on — was producing cells. Six on PHDC at +58% to +404% against the price it was struck at, one on PHAR at −175%. Asking why produced the finding of the night, in two steps.</w:t>
+      </w:r>
+    </w:p>
+    <w:p>
+      <w:r>
+        <w:rPr>
+          <w:b/>
+        </w:rPr>
+        <w:t>First, every cell breached a standing rule.</w:t>
+      </w:r>
+      <w:r>
+        <w:t xml:space="preserve"> </w:t>
+      </w:r>
+      <w:r>
+        <w:rPr>
+          <w:rFonts w:ascii="Consolas" w:hAnsi="Consolas"/>
+          <w:sz w:val="19"/>
+        </w:rPr>
+        <w:t>[R-MACRO-01]</w:t>
+      </w:r>
+      <w:r>
+        <w:t xml:space="preserve"> has required since 2 September — four days </w:t>
+      </w:r>
+      <w:r>
+        <w:rPr>
+          <w:i/>
+        </w:rPr>
+        <w:t>before</w:t>
+      </w:r>
+      <w:r>
+        <w:t xml:space="preserve"> the declaration that sealed this lens — that an explicit window run until growth is within 2pp of the terminal, </w:t>
+      </w:r>
+      <w:r>
+        <w:rPr>
+          <w:i/>
+        </w:rPr>
+        <w:t>"or the terminal capitalises a rate the model never reached"</w:t>
+      </w:r>
+      <w:r>
+        <w:t>. Measured on all seven cells the lens had ever scored:</w:t>
+      </w:r>
+    </w:p>
+    <w:tbl>
+      <w:tblPr>
+        <w:tblStyle w:val="TableGrid"/>
+        <w:tblW w:type="auto" w:w="0"/>
+        <w:jc w:val="center"/>
+        <w:tblLayout w:type="fixed"/>
+        <w:tblLook w:firstColumn="1" w:firstRow="1" w:lastColumn="0" w:lastRow="0" w:noHBand="0" w:noVBand="1" w:val="04A0"/>
+      </w:tblPr>
+      <w:tblGrid>
+        <w:gridCol w:w="454"/>
+        <w:gridCol w:w="3515"/>
+        <w:gridCol w:w="1134"/>
+        <w:gridCol w:w="2211"/>
+        <w:gridCol w:w="2098"/>
+      </w:tblGrid>
+      <w:tr>
+        <w:tc>
+          <w:tcPr>
+            <w:tcW w:type="dxa" w:w="454"/>
+            <w:shd w:val="clear" w:color="auto" w:fill="EDF0F3"/>
+          </w:tcPr>
+          <w:p>
+            <w:r>
+              <w:rPr>
+                <w:b/>
+              </w:rPr>
+            </w:r>
+            <w:r>
+              <w:rPr>
+                <w:b/>
+                <w:sz w:val="16"/>
+              </w:rPr>
+              <w:t>cell</w:t>
+            </w:r>
+          </w:p>
+        </w:tc>
+        <w:tc>
+          <w:tcPr>
+            <w:tcW w:type="dxa" w:w="3515"/>
+            <w:shd w:val="clear" w:color="auto" w:fill="EDF0F3"/>
+          </w:tcPr>
+          <w:p>
+            <w:r>
+              <w:rPr>
+                <w:b/>
+              </w:rPr>
+            </w:r>
+            <w:r>
+              <w:rPr>
+                <w:b/>
+                <w:sz w:val="16"/>
+              </w:rPr>
+              <w:t>growth at the last explicit year</w:t>
+            </w:r>
+          </w:p>
+        </w:tc>
+        <w:tc>
+          <w:tcPr>
+            <w:tcW w:type="dxa" w:w="1134"/>
+            <w:shd w:val="clear" w:color="auto" w:fill="EDF0F3"/>
+          </w:tcPr>
+          <w:p>
+            <w:r>
+              <w:rPr>
+                <w:b/>
+              </w:rPr>
+            </w:r>
+            <w:r>
+              <w:rPr>
+                <w:b/>
+                <w:sz w:val="16"/>
+              </w:rPr>
+              <w:t>terminal</w:t>
+            </w:r>
+          </w:p>
+        </w:tc>
+        <w:tc>
+          <w:tcPr>
+            <w:tcW w:type="dxa" w:w="2211"/>
+            <w:shd w:val="clear" w:color="auto" w:fill="EDF0F3"/>
+          </w:tcPr>
+          <w:p>
+            <w:r>
+              <w:rPr>
+                <w:b/>
+              </w:rPr>
+            </w:r>
+            <w:r>
+              <w:rPr>
+                <w:b/>
+                <w:sz w:val="16"/>
+              </w:rPr>
+              <w:t>gap</w:t>
+            </w:r>
+          </w:p>
+        </w:tc>
+        <w:tc>
+          <w:tcPr>
+            <w:tcW w:type="dxa" w:w="2098"/>
+            <w:shd w:val="clear" w:color="auto" w:fill="EDF0F3"/>
+          </w:tcPr>
+          <w:p>
+            <w:r>
+              <w:rPr>
+                <w:b/>
+              </w:rPr>
+            </w:r>
+            <w:r>
+              <w:rPr>
+                <w:b/>
+                <w:sz w:val="16"/>
+              </w:rPr>
+              <w:t>terminal share of EV</w:t>
+            </w:r>
+          </w:p>
+        </w:tc>
+      </w:tr>
+      <w:tr>
+        <w:tc>
+          <w:tcPr>
+            <w:tcW w:type="dxa" w:w="454"/>
+          </w:tcPr>
+          <w:p>
+            <w:r/>
+            <w:r>
+              <w:rPr>
+                <w:sz w:val="16"/>
+              </w:rPr>
+              <w:t>PHAR 2023</w:t>
+            </w:r>
+          </w:p>
+        </w:tc>
+        <w:tc>
+          <w:tcPr>
+            <w:tcW w:type="dxa" w:w="3515"/>
+          </w:tcPr>
+          <w:p>
+            <w:r/>
+            <w:r>
+              <w:rPr>
+                <w:sz w:val="16"/>
+              </w:rPr>
+              <w:t>22.1%</w:t>
+            </w:r>
+          </w:p>
+        </w:tc>
+        <w:tc>
+          <w:tcPr>
+            <w:tcW w:type="dxa" w:w="1134"/>
+          </w:tcPr>
+          <w:p>
+            <w:r/>
+            <w:r>
+              <w:rPr>
+                <w:sz w:val="16"/>
+              </w:rPr>
+              <w:t>9.5%</w:t>
+            </w:r>
+          </w:p>
+        </w:tc>
+        <w:tc>
+          <w:tcPr>
+            <w:tcW w:type="dxa" w:w="2211"/>
+          </w:tcPr>
+          <w:p>
+            <w:r/>
+            <w:r>
+              <w:rPr>
+                <w:sz w:val="16"/>
+              </w:rPr>
+              <w:t>12.6pp</w:t>
+            </w:r>
+          </w:p>
+        </w:tc>
+        <w:tc>
+          <w:tcPr>
+            <w:tcW w:type="dxa" w:w="2098"/>
+          </w:tcPr>
+          <w:p>
+            <w:r/>
+            <w:r>
+              <w:rPr>
+                <w:b/>
+                <w:sz w:val="16"/>
+              </w:rPr>
+              <w:t>1820%</w:t>
+            </w:r>
+          </w:p>
+        </w:tc>
+      </w:tr>
+      <w:tr>
+        <w:tc>
+          <w:tcPr>
+            <w:tcW w:type="dxa" w:w="454"/>
+          </w:tcPr>
+          <w:p>
+            <w:r/>
+            <w:r>
+              <w:rPr>
+                <w:sz w:val="16"/>
+              </w:rPr>
+              <w:t>PHDC 2018</w:t>
+            </w:r>
+          </w:p>
+        </w:tc>
+        <w:tc>
+          <w:tcPr>
+            <w:tcW w:type="dxa" w:w="3515"/>
+          </w:tcPr>
+          <w:p>
+            <w:r/>
+            <w:r>
+              <w:rPr>
+                <w:sz w:val="16"/>
+              </w:rPr>
+              <w:t>22.6%</w:t>
+            </w:r>
+          </w:p>
+        </w:tc>
+        <w:tc>
+          <w:tcPr>
+            <w:tcW w:type="dxa" w:w="1134"/>
+          </w:tcPr>
+          <w:p>
+            <w:r/>
+            <w:r>
+              <w:rPr>
+                <w:sz w:val="16"/>
+              </w:rPr>
+              <w:t>7.0%</w:t>
+            </w:r>
+          </w:p>
+        </w:tc>
+        <w:tc>
+          <w:tcPr>
+            <w:tcW w:type="dxa" w:w="2211"/>
+          </w:tcPr>
+          <w:p>
+            <w:r/>
+            <w:r>
+              <w:rPr>
+                <w:sz w:val="16"/>
+              </w:rPr>
+              <w:t>15.6pp</w:t>
+            </w:r>
+          </w:p>
+        </w:tc>
+        <w:tc>
+          <w:tcPr>
+            <w:tcW w:type="dxa" w:w="2098"/>
+          </w:tcPr>
+          <w:p>
+            <w:r/>
+            <w:r>
+              <w:rPr>
+                <w:sz w:val="16"/>
+              </w:rPr>
+              <w:t>125%</w:t>
+            </w:r>
+          </w:p>
+        </w:tc>
+      </w:tr>
+      <w:tr>
+        <w:tc>
+          <w:tcPr>
+            <w:tcW w:type="dxa" w:w="454"/>
+          </w:tcPr>
+          <w:p>
+            <w:r/>
+            <w:r>
+              <w:rPr>
+                <w:sz w:val="16"/>
+              </w:rPr>
+              <w:t>PHDC 2019</w:t>
+            </w:r>
+          </w:p>
+        </w:tc>
+        <w:tc>
+          <w:tcPr>
+            <w:tcW w:type="dxa" w:w="3515"/>
+          </w:tcPr>
+          <w:p>
+            <w:r/>
+            <w:r>
+              <w:rPr>
+                <w:sz w:val="16"/>
+              </w:rPr>
+              <w:t>20.7%</w:t>
+            </w:r>
+          </w:p>
+        </w:tc>
+        <w:tc>
+          <w:tcPr>
+            <w:tcW w:type="dxa" w:w="1134"/>
+          </w:tcPr>
+          <w:p>
+            <w:r/>
+            <w:r>
+              <w:rPr>
+                <w:sz w:val="16"/>
+              </w:rPr>
+              <w:t>7.1%</w:t>
+            </w:r>
+          </w:p>
+        </w:tc>
+        <w:tc>
+          <w:tcPr>
+            <w:tcW w:type="dxa" w:w="2211"/>
+          </w:tcPr>
+          <w:p>
+            <w:r/>
+            <w:r>
+              <w:rPr>
+                <w:sz w:val="16"/>
+              </w:rPr>
+              <w:t>13.6pp</w:t>
+            </w:r>
+          </w:p>
+        </w:tc>
+        <w:tc>
+          <w:tcPr>
+            <w:tcW w:type="dxa" w:w="2098"/>
+          </w:tcPr>
+          <w:p>
+            <w:r/>
+            <w:r>
+              <w:rPr>
+                <w:sz w:val="16"/>
+              </w:rPr>
+              <w:t>108%</w:t>
+            </w:r>
+          </w:p>
+        </w:tc>
+      </w:tr>
+      <w:tr>
+        <w:tc>
+          <w:tcPr>
+            <w:tcW w:type="dxa" w:w="454"/>
+          </w:tcPr>
+          <w:p>
+            <w:r/>
+            <w:r>
+              <w:rPr>
+                <w:sz w:val="16"/>
+              </w:rPr>
+              <w:t>PHDC 2020</w:t>
+            </w:r>
+          </w:p>
+        </w:tc>
+        <w:tc>
+          <w:tcPr>
+            <w:tcW w:type="dxa" w:w="3515"/>
+          </w:tcPr>
+          <w:p>
+            <w:r/>
+            <w:r>
+              <w:rPr>
+                <w:sz w:val="16"/>
+              </w:rPr>
+              <w:t>12.1%</w:t>
+            </w:r>
+          </w:p>
+        </w:tc>
+        <w:tc>
+          <w:tcPr>
+            <w:tcW w:type="dxa" w:w="1134"/>
+          </w:tcPr>
+          <w:p>
+            <w:r/>
+            <w:r>
+              <w:rPr>
+                <w:sz w:val="16"/>
+              </w:rPr>
+              <w:t>8.2%</w:t>
+            </w:r>
+          </w:p>
+        </w:tc>
+        <w:tc>
+          <w:tcPr>
+            <w:tcW w:type="dxa" w:w="2211"/>
+          </w:tcPr>
+          <w:p>
+            <w:r/>
+            <w:r>
+              <w:rPr>
+                <w:b/>
+                <w:sz w:val="16"/>
+              </w:rPr>
+              <w:t>3.8pp</w:t>
+            </w:r>
+          </w:p>
+        </w:tc>
+        <w:tc>
+          <w:tcPr>
+            <w:tcW w:type="dxa" w:w="2098"/>
+          </w:tcPr>
+          <w:p>
+            <w:r/>
+            <w:r>
+              <w:rPr>
+                <w:sz w:val="16"/>
+              </w:rPr>
+              <w:t>102%</w:t>
+            </w:r>
+          </w:p>
+        </w:tc>
+      </w:tr>
+    </w:tbl>
+    <w:p/>
+    <w:p>
+      <w:r>
+        <w:t xml:space="preserve">All seven. The best is 3.8pp against a bound of 2pp. Six of seven carry a terminal worth </w:t>
+      </w:r>
+      <w:r>
+        <w:rPr>
+          <w:b/>
+        </w:rPr>
+        <w:t>more than the whole enterprise value</w:t>
+      </w:r>
+      <w:r>
+        <w:t xml:space="preserve">, which is to say an explicit window contributing nothing or less: PHDC 2019's five explicit years have a present value of </w:t>
+      </w:r>
+      <w:r>
+        <w:rPr>
+          <w:b/>
+        </w:rPr>
+        <w:t>−EGP 2.28bn</w:t>
+      </w:r>
+      <w:r>
+        <w:t xml:space="preserve"> against a terminal of </w:t>
+      </w:r>
+      <w:r>
+        <w:rPr>
+          <w:b/>
+        </w:rPr>
+        <w:t>+EGP 32.52bn</w:t>
+      </w:r>
+      <w:r>
+        <w:t>.</w:t>
+      </w:r>
+    </w:p>
+    <w:p>
+      <w:r>
+        <w:rPr>
+          <w:b/>
+        </w:rPr>
+        <w:t>Second, and this is the part that matters:</w:t>
+      </w:r>
+      <w:r>
+        <w:t xml:space="preserve"> every delivered study that commits the record converges </w:t>
+      </w:r>
+      <w:r>
+        <w:rPr>
+          <w:i/>
+        </w:rPr>
+        <w:t>exactly</w:t>
+      </w:r>
+      <w:r>
+        <w:t xml:space="preserve"> to its terminal — </w:t>
+      </w:r>
+      <w:r>
+        <w:rPr>
+          <w:b/>
+        </w:rPr>
+        <w:t>PHDC on fifteen explicit years, TMGH on ten</w:t>
+      </w:r>
+      <w:r>
+        <w:t xml:space="preserve">, the rest on five. The lens runs </w:t>
+      </w:r>
+      <w:r>
+        <w:rPr>
+          <w:b/>
+        </w:rPr>
+        <w:t>five for every name</w:t>
+      </w:r>
+      <w:r>
+        <w:t xml:space="preserve">, because its sealed declaration fixes the window at the walk-forward's own horizons 1–5 and says in terms that it </w:t>
+      </w:r>
+      <w:r>
+        <w:rPr>
+          <w:i/>
+        </w:rPr>
+        <w:t>"is not re-derived here"</w:t>
+      </w:r>
+      <w:r>
+        <w:t>.</w:t>
+      </w:r>
+    </w:p>
+    <w:p>
+      <w:r>
+        <w:t>So on PHDC the instrument rebuilds a fifteen-year construction on five years. Same drivers, same statements, same point-in-time archive, same sanctioned terminal module — and a third of the answer.</w:t>
+      </w:r>
+    </w:p>
+    <w:p>
+      <w:r>
+        <w:rPr>
+          <w:rFonts w:ascii="Consolas" w:hAnsi="Consolas"/>
+          <w:sz w:val="19"/>
+        </w:rPr>
+        <w:t>[R-VCAL-01]</w:t>
+      </w:r>
+      <w:r>
+        <w:t xml:space="preserve"> states its own falsifier: </w:t>
+      </w:r>
+      <w:r>
+        <w:rPr>
+          <w:i/>
+        </w:rPr>
+        <w:t>if the mechanically rebuilt series turns out not to resemble the as-delivered one, this calibration is grading a method the house does not use.</w:t>
+      </w:r>
+      <w:r>
+        <w:t xml:space="preserve"> That falsifier anticipated a statistical comparison over a long record. </w:t>
+      </w:r>
+      <w:r>
+        <w:rPr>
+          <w:b/>
+        </w:rPr>
+        <w:t>What arrived is structural and stronger.</w:t>
+      </w:r>
+    </w:p>
+    <w:p>
+      <w:pPr>
+        <w:pStyle w:val="Heading3"/>
+      </w:pPr>
+      <w:r>
+        <w:t>Why the mechanical paths do not converge, and the route that does</w:t>
+      </w:r>
+    </w:p>
+    <w:p>
+      <w:r>
+        <w:t xml:space="preserve">The walk-forward projectors escalate on </w:t>
+      </w:r>
+      <w:r>
+        <w:rPr>
+          <w:rFonts w:ascii="Consolas" w:hAnsi="Consolas"/>
+          <w:sz w:val="19"/>
+        </w:rPr>
+        <w:t>(1 + cpi(origin)) ** h</w:t>
+      </w:r>
+      <w:r>
+        <w:t xml:space="preserve"> — the </w:t>
+      </w:r>
+      <w:r>
+        <w:rPr>
+          <w:b/>
+        </w:rPr>
+        <w:t>last published</w:t>
+      </w:r>
+      <w:r>
+        <w:t xml:space="preserve"> inflation print, compounded flat at every horizon. At a 31-December-2019 Egyptian origin that is 13.87% for five straight years, arriving at a 7% terminal still growing at four times it. The house's studies converge because their escalators sit on a </w:t>
+      </w:r>
+      <w:r>
+        <w:rPr>
+          <w:b/>
+        </w:rPr>
+        <w:t>declining ladder</w:t>
+      </w:r>
+      <w:r>
+        <w:t>.</w:t>
+      </w:r>
+    </w:p>
+    <w:p>
+      <w:r>
+        <w:rPr>
+          <w:b/>
+        </w:rPr>
+        <w:t>Point-in-time discipline forbids foresight, not a declining forecast</w:t>
+      </w:r>
+      <w:r>
+        <w:t xml:space="preserve"> — and a forecast published at the origin was known at the origin. </w:t>
+      </w:r>
+      <w:r>
+        <w:rPr>
+          <w:rFonts w:ascii="Consolas" w:hAnsi="Consolas"/>
+          <w:sz w:val="19"/>
+        </w:rPr>
+        <w:t>engine/macro_history/</w:t>
+      </w:r>
+      <w:r>
+        <w:t xml:space="preserve"> already holds eleven IMF World Economic Outlook vintages for Egypt, each with its file name and sha256. The October 2019 edition projects:</w:t>
+      </w:r>
+    </w:p>
+    <w:p>
+      <w:pPr>
+        <w:ind w:left="454"/>
+        <w:pBdr>
+          <w:left w:val="single" w:sz="12" w:color="8F7326" w:space="8"/>
+        </w:pBdr>
+      </w:pPr>
+      <w:r>
+        <w:rPr>
+          <w:b/>
+        </w:rPr>
+        <w:t>13.866 → 9.965 → 7.217 → 7.011 → 7.002 → 7.078</w:t>
+      </w:r>
+    </w:p>
+    <w:p>
+      <w:r>
+        <w:t>It converges to the house terminal by year three, on its own, with no fade and no free parameter.</w:t>
+      </w:r>
+    </w:p>
+    <w:p>
+      <w:pPr>
+        <w:pStyle w:val="Heading3"/>
+      </w:pPr>
+      <w:r>
+        <w:t>What was not done, and why that is the discipline</w:t>
+      </w:r>
+    </w:p>
+    <w:p>
+      <w:r>
+        <w:rPr>
+          <w:b/>
+        </w:rPr>
+        <w:t>The lens was not rebuilt on that ladder.</w:t>
+      </w:r>
+      <w:r>
+        <w:t xml:space="preserve"> The pre-registration's whole claim on credibility is an ordering of commits — written, hashed and committed before any figure existed, so </w:t>
+      </w:r>
+      <w:r>
+        <w:rPr>
+          <w:i/>
+        </w:rPr>
+        <w:t>"no lever was fitted to the gap"</w:t>
+      </w:r>
+      <w:r>
+        <w:t xml:space="preserve"> is a fact about topology rather than an assurance, and </w:t>
+      </w:r>
+      <w:r>
+        <w:rPr>
+          <w:rFonts w:ascii="Consolas" w:hAnsi="Consolas"/>
+          <w:sz w:val="19"/>
+        </w:rPr>
+        <w:t>check_valuation_calibration.py</w:t>
+      </w:r>
+      <w:r>
+        <w:t xml:space="preserve"> reads that topology precisely to catch a design that followed its results. A declaration written now is written with the gap in full view.</w:t>
+      </w:r>
+    </w:p>
+    <w:p>
+      <w:r>
+        <w:t xml:space="preserve">It is registered instead, as </w:t>
+      </w:r>
+      <w:r>
+        <w:rPr>
+          <w:rFonts w:ascii="Consolas" w:hAnsi="Consolas"/>
+          <w:sz w:val="19"/>
+        </w:rPr>
+        <w:t>mechanical-lens-window-reseal</w:t>
+      </w:r>
+      <w:r>
+        <w:t xml:space="preserve"> in </w:t>
+      </w:r>
+      <w:r>
+        <w:rPr>
+          <w:rFonts w:ascii="Consolas" w:hAnsi="Consolas"/>
+          <w:sz w:val="19"/>
+        </w:rPr>
+        <w:t>engine/escalations.json</w:t>
+      </w:r>
+      <w:r>
+        <w:t xml:space="preserve">, with five climbed routes, the measurement, a recommendation, a default and a date. </w:t>
+      </w:r>
+      <w:r>
+        <w:rPr>
+          <w:b/>
+        </w:rPr>
+        <w:t>The recommendation is to re-seal, and to say in the new declaration that it was written after the old one was measured</w:t>
+      </w:r>
+      <w:r>
+        <w:t xml:space="preserve"> — which is the only honest way to do it.</w:t>
+      </w:r>
+    </w:p>
+    <w:p>
+      <w:r>
+        <w:rPr>
+          <w:b/>
+        </w:rPr>
+        <w:t>What this costs is stated rather than discovered later:</w:t>
+      </w:r>
+      <w:r>
+        <w:t xml:space="preserve"> criterion 3's clause A moves from NOT MET to </w:t>
+      </w:r>
+      <w:r>
+        <w:rPr>
+          <w:b/>
+        </w:rPr>
+        <w:t>UNMEASURED</w:t>
+      </w:r>
+      <w:r>
+        <w:t xml:space="preserve">, with B, C and F. That is not a softening. A verdict reached on five cells built on a forbidden construction is a false verdict. Phase 1 does not close either way, so </w:t>
+      </w:r>
+      <w:r>
+        <w:rPr>
+          <w:b/>
+        </w:rPr>
+        <w:t>no publish decision changed and no fair value moved</w:t>
+      </w:r>
+      <w:r>
+        <w:t>.</w:t>
+      </w:r>
+    </w:p>
+    <w:p>
+      <w:pPr>
+        <w:pStyle w:val="Heading3"/>
+      </w:pPr>
+      <w:r>
+        <w:t>Four instruments had to be corrected to report that state at all</w:t>
+      </w:r>
+    </w:p>
+    <w:p>
+      <w:r>
+        <w:t>Each a small instance of one species — a reporter that cannot express the answer it now has:</w:t>
+      </w:r>
+    </w:p>
+    <w:p>
+      <w:pPr>
+        <w:pStyle w:val="ListNumber"/>
+        <w:numPr>
+          <w:ilvl w:val="0"/>
+          <w:numId w:val="13"/>
+        </w:numPr>
+      </w:pPr>
+      <w:r>
+        <w:rPr>
+          <w:rFonts w:ascii="Consolas" w:hAnsi="Consolas"/>
+          <w:sz w:val="19"/>
+        </w:rPr>
+        <w:t>criterion3.clause_a</w:t>
+      </w:r>
+      <w:r>
+        <w:t xml:space="preserve"> </w:t>
+      </w:r>
+      <w:r>
+        <w:rPr>
+          <w:b/>
+        </w:rPr>
+        <w:t>crashed</w:t>
+      </w:r>
+      <w:r>
+        <w:t xml:space="preserve"> on an empty series.</w:t>
+      </w:r>
+    </w:p>
+    <w:p>
+      <w:pPr>
+        <w:pStyle w:val="ListNumber"/>
+        <w:numPr>
+          <w:ilvl w:val="0"/>
+          <w:numId w:val="13"/>
+        </w:numPr>
+      </w:pPr>
+      <w:r>
+        <w:t xml:space="preserve">Its verdict line collapsed </w:t>
+      </w:r>
+      <w:r>
+        <w:rPr>
+          <w:rFonts w:ascii="Consolas" w:hAnsi="Consolas"/>
+          <w:sz w:val="19"/>
+        </w:rPr>
+        <w:t>None</w:t>
+      </w:r>
+      <w:r>
+        <w:t xml:space="preserve"> onto NOT MET — three states printed as two, in the</w:t>
+      </w:r>
+    </w:p>
+    <w:p>
+      <w:r>
+        <w:t xml:space="preserve">   clause that gates Phase 1 hardest. B and C already printed all three.</w:t>
+      </w:r>
+    </w:p>
+    <w:p>
+      <w:pPr>
+        <w:pStyle w:val="ListNumber"/>
+        <w:numPr>
+          <w:ilvl w:val="0"/>
+          <w:numId w:val="14"/>
+        </w:numPr>
+      </w:pPr>
+      <w:r>
+        <w:rPr>
+          <w:rFonts w:ascii="Consolas" w:hAnsi="Consolas"/>
+          <w:sz w:val="19"/>
+        </w:rPr>
+        <w:t>score_cashflow</w:t>
+      </w:r>
+      <w:r>
+        <w:t xml:space="preserve"> printed </w:t>
+      </w:r>
+      <w:r>
+        <w:rPr>
+          <w:rFonts w:ascii="Consolas" w:hAnsi="Consolas"/>
+          <w:sz w:val="19"/>
+        </w:rPr>
+        <w:t>WHY 28 OF 33 READY CELLS</w:t>
+      </w:r>
+      <w:r>
+        <w:t xml:space="preserve"> as a </w:t>
+      </w:r>
+      <w:r>
+        <w:rPr>
+          <w:b/>
+        </w:rPr>
+        <w:t>typed literal</w:t>
+      </w:r>
+      <w:r>
+        <w:t>, through</w:t>
+      </w:r>
+    </w:p>
+    <w:p>
+      <w:r>
+        <w:t xml:space="preserve">   two population changes, in the calibration's own reporter.</w:t>
+      </w:r>
+    </w:p>
+    <w:p>
+      <w:pPr>
+        <w:pStyle w:val="ListNumber"/>
+        <w:numPr>
+          <w:ilvl w:val="0"/>
+          <w:numId w:val="15"/>
+        </w:numPr>
+      </w:pPr>
+      <w:r>
+        <w:t xml:space="preserve">Its drop taxonomy filed the new refusal under </w:t>
+      </w:r>
+      <w:r>
+        <w:rPr>
+          <w:rFonts w:ascii="Consolas" w:hAnsi="Consolas"/>
+          <w:sz w:val="19"/>
+        </w:rPr>
+        <w:t>other</w:t>
+      </w:r>
+      <w:r>
+        <w:t>, where the **largest cause in</w:t>
+      </w:r>
+    </w:p>
+    <w:p>
+      <w:r>
+        <w:t xml:space="preserve">   the table</w:t>
+      </w:r>
+      <w:r>
+        <w:rPr>
+          <w:b/>
+        </w:rPr>
+        <w:t xml:space="preserve"> would have been invisible; and the narrative beneath asserted *"the    largest class is a DATA-CARRY job"* as prose beside a computed table. It is now    </w:t>
+      </w:r>
+      <w:r>
+        <w:t>selected by** the table. The reading it had been carrying was the comfortable one:    work with a rate, owed by nobody's method.</w:t>
+      </w:r>
+    </w:p>
+    <w:p>
+      <w:pPr>
+        <w:pStyle w:val="Heading3"/>
+      </w:pPr>
+      <w:r>
+        <w:t>Beside it, three shared defects closed and one counted</w:t>
+      </w:r>
+    </w:p>
+    <w:p>
+      <w:pPr>
+        <w:pStyle w:val="ListBullet"/>
+      </w:pPr>
+      <w:r>
+        <w:rPr>
+          <w:b/>
+        </w:rPr>
+        <w:t>The terminal equity risk premium.</w:t>
+      </w:r>
+      <w:r>
+        <w:t xml:space="preserve"> Five of seven macro paths cite Damodaran with a</w:t>
+      </w:r>
+    </w:p>
+    <w:p>
+      <w:r>
+        <w:t xml:space="preserve">  publication date and hold the published ERP flat; AE holds it flat and says so. </w:t>
+      </w:r>
+      <w:r>
+        <w:rPr>
+          <w:b/>
+        </w:rPr>
+        <w:t>Egypt   alone normalises</w:t>
+      </w:r>
+      <w:r>
+        <w:t xml:space="preserve">, on a source field that names no institution, no date and no   identity — retiring 2.41 to 6.94 points of country risk, and it is the one convention   in the book running the </w:t>
+      </w:r>
+      <w:r>
+        <w:rPr>
+          <w:b/>
+        </w:rPr>
+        <w:t>optimistic</w:t>
+      </w:r>
+      <w:r>
+        <w:t xml:space="preserve"> way. The validator now requires a declared basis   from a closed list; the decision to change the number is registered, not taken.</w:t>
+      </w:r>
+    </w:p>
+    <w:p>
+      <w:pPr>
+        <w:pStyle w:val="ListBullet"/>
+      </w:pPr>
+      <w:r>
+        <w:rPr>
+          <w:b/>
+        </w:rPr>
+        <w:t>The delivered bibliography.</w:t>
+      </w:r>
+      <w:r>
+        <w:t xml:space="preserve"> The source gate read the committed register, where</w:t>
+      </w:r>
+    </w:p>
+    <w:p>
+      <w:r>
+        <w:t xml:space="preserve">  every source names a filing, and passed the book. The </w:t>
+      </w:r>
+      <w:r>
+        <w:rPr>
+          <w:b/>
+        </w:rPr>
+        <w:t>bibliography</w:t>
+      </w:r>
+      <w:r>
+        <w:t xml:space="preserve"> cites   aggregators for the subject's own balance sheet — AMOC one row, ELEC twelve, SCEM one.   Now gated, with the false-positive rate measured at 0.119% after two re-pointings.</w:t>
+      </w:r>
+    </w:p>
+    <w:p>
+      <w:pPr>
+        <w:pStyle w:val="ListBullet"/>
+      </w:pPr>
+      <w:r>
+        <w:rPr>
+          <w:b/>
+        </w:rPr>
+        <w:t>A rule cited as a reason.</w:t>
+      </w:r>
+      <w:r>
+        <w:t xml:space="preserve"> </w:t>
+      </w:r>
+      <w:r>
+        <w:rPr>
+          <w:rFonts w:ascii="Consolas" w:hAnsi="Consolas"/>
+          <w:sz w:val="19"/>
+        </w:rPr>
+        <w:t>[R-REBUILD-01] clause two</w:t>
+      </w:r>
+      <w:r>
+        <w:t xml:space="preserve"> was adopted that morning on</w:t>
+      </w:r>
+    </w:p>
+    <w:p>
+      <w:r>
+        <w:t xml:space="preserve">  AMOC's forecast-anchor record. By evening the misreading had been found in </w:t>
+      </w:r>
+      <w:r>
+        <w:rPr>
+          <w:b/>
+        </w:rPr>
+        <w:t>seven   passages</w:t>
+      </w:r>
+      <w:r>
+        <w:t xml:space="preserve">, and </w:t>
+      </w:r>
+      <w:r>
+        <w:rPr>
+          <w:b/>
+        </w:rPr>
+        <w:t>every one deferred a correction that raises the value</w:t>
+      </w:r>
+      <w:r>
+        <w:t xml:space="preserve">. One did it   without naming the rule at all: </w:t>
+      </w:r>
+      <w:r>
+        <w:rPr>
+          <w:i/>
+        </w:rPr>
+        <w:t>"a second would land +30.5%, crossing from one side of   the price to the other."</w:t>
+      </w:r>
+      <w:r>
+        <w:t xml:space="preserve"> That is the price used as a target, in the direction of   inaction — invisible to every check that watches for a value being moved </w:t>
+      </w:r>
+      <w:r>
+        <w:rPr>
+          <w:i/>
+        </w:rPr>
+        <w:t>toward</w:t>
+      </w:r>
+      <w:r>
+        <w:t xml:space="preserve"> a   quote. All seven corrected; none ratcheted; no value moved, because every one already   carried its measurement.</w:t>
+      </w:r>
+    </w:p>
+    <w:p>
+      <w:pPr>
+        <w:pStyle w:val="ListBullet"/>
+      </w:pPr>
+      <w:r>
+        <w:rPr>
+          <w:b/>
+        </w:rPr>
+        <w:t>The debt itself.</w:t>
+      </w:r>
+      <w:r>
+        <w:t xml:space="preserve"> </w:t>
+      </w:r>
+      <w:r>
+        <w:rPr>
+          <w:rFonts w:ascii="Consolas" w:hAnsi="Consolas"/>
+          <w:sz w:val="19"/>
+        </w:rPr>
+        <w:t>[R-REPAIR-01]</w:t>
+      </w:r>
+      <w:r>
+        <w:t xml:space="preserve"> was adopted on *"47 ratchet entries accumulated on</w:t>
+      </w:r>
+    </w:p>
+    <w:p>
+      <w:r>
+        <w:t xml:space="preserve">  five studies"</w:t>
+      </w:r>
+      <w:r>
+        <w:rPr>
+          <w:i/>
+        </w:rPr>
+        <w:t>. Counted across all 67 ratchets: **386 entries across 94 names.*</w:t>
+      </w:r>
+      <w:r>
+        <w:t xml:space="preserve"> The   reader refuses any key it cannot classify, and its first run returned eleven questions,   two names that were index series rather than studies, and </w:t>
+      </w:r>
+      <w:r>
+        <w:rPr>
+          <w:rFonts w:ascii="Consolas" w:hAnsi="Consolas"/>
+          <w:sz w:val="19"/>
+        </w:rPr>
+        <w:t>2POINTZERO</w:t>
+      </w:r>
+      <w:r>
+        <w:t xml:space="preserve"> — a ticker the   first draft's pattern silently dropped, exactly as this protocol already records three   other tools dropping it.</w:t>
+      </w:r>
+    </w:p>
+    <w:p>
+      <w:pPr>
+        <w:pStyle w:val="Heading3"/>
+      </w:pPr>
+      <w:r>
+        <w:t>The general lesson of the night</w:t>
+      </w:r>
+    </w:p>
+    <w:p>
+      <w:r>
+        <w:rPr>
+          <w:b/>
+        </w:rPr>
+        <w:t>An instrument built to grade a method must reproduce the method, and sharing its inputs is not reproducing it.</w:t>
+      </w:r>
+      <w:r>
+        <w:t xml:space="preserve"> Series (a) takes the same drivers, the same statements, the same archive and the same terminal module as the studies it grades, and stops the forecast ten years earlier than one of them does. Every input agreed and the answer was a third of the size.</w:t>
       </w:r>
     </w:p>
     <w:sectPr>
@@ -19247,6 +20366,24 @@
     </w:lvlOverride>
   </w:num>
   <w:num w:numId="12">
+    <w:abstractNumId w:val="7"/>
+    <w:lvlOverride w:ilvl="0">
+      <w:startOverride w:val="1"/>
+    </w:lvlOverride>
+  </w:num>
+  <w:num w:numId="13">
+    <w:abstractNumId w:val="7"/>
+    <w:lvlOverride w:ilvl="0">
+      <w:startOverride w:val="1"/>
+    </w:lvlOverride>
+  </w:num>
+  <w:num w:numId="14">
+    <w:abstractNumId w:val="7"/>
+    <w:lvlOverride w:ilvl="0">
+      <w:startOverride w:val="1"/>
+    </w:lvlOverride>
+  </w:num>
+  <w:num w:numId="15">
     <w:abstractNumId w:val="7"/>
     <w:lvlOverride w:ilvl="0">
       <w:startOverride w:val="1"/>

</xml_diff>